<commit_message>
Snapshot v3.4 regression, LAN delivery, and text evaluation tooling
Preserve the existing working tree before further isolated localization
experiments. Includes mounted-storage safety, regression/evaluation evidence,
legacy qualification decisions, the read-only LAN report portal, and the
project use/processing scope. No new production implementation is introduced
by this snapshot operation.

Validation: 16 related test entrypoints and the benchmark supervisor self-test
pass; Python syntax, shell syntax, and git diff checks pass.

Known baseline test failure: tests/test_publish_smb.py has an obsolete shell
runner fixture. Its six RegressionRunnerTests subcases expect the old shell
stages and do not simulate the current Python runner; tests/test_v34_runner.py
passes. Preserve this known failure instead of altering the baseline.

Media, models, runtime state, evaluation responses, and credentials are excluded.
This commit is a development snapshot, not a release acceptance.
</commit_message>
<xml_diff>
--- a/Documentation/v1/功能报告_界面分步说明.docx
+++ b/Documentation/v1/功能报告_界面分步说明.docx
@@ -2,6 +2,139 @@
 <file path=word/document.xml><?xml version="1.0" encoding="utf-8"?>
 <w:document xmlns:wpc="http://schemas.microsoft.com/office/word/2010/wordprocessingCanvas" xmlns:mo="http://schemas.microsoft.com/office/mac/office/2008/main" xmlns:mc="http://schemas.openxmlformats.org/markup-compatibility/2006" xmlns:mv="urn:schemas-microsoft-com:mac:vml" xmlns:o="urn:schemas-microsoft-com:office:office" xmlns:r="http://schemas.openxmlformats.org/officeDocument/2006/relationships" xmlns:m="http://schemas.openxmlformats.org/officeDocument/2006/math" xmlns:v="urn:schemas-microsoft-com:vml" xmlns:wp14="http://schemas.microsoft.com/office/word/2010/wordprocessingDrawing" xmlns:wp="http://schemas.openxmlformats.org/drawingml/2006/wordprocessingDrawing" xmlns:w10="urn:schemas-microsoft-com:office:word" xmlns:w="http://schemas.openxmlformats.org/wordprocessingml/2006/main" xmlns:w14="http://schemas.microsoft.com/office/word/2010/wordml" xmlns:wpg="http://schemas.microsoft.com/office/word/2010/wordprocessingGroup" xmlns:wpi="http://schemas.microsoft.com/office/word/2010/wordprocessingInk" xmlns:wne="http://schemas.microsoft.com/office/word/2006/wordml" xmlns:wps="http://schemas.microsoft.com/office/word/2010/wordprocessingShape" mc:Ignorable="w14 wp14">
   <w:body>
+    <w:p>
+      <w:pPr>
+        <w:keepLines/>
+        <w:spacing w:before="240" w:after="240" w:line="340" w:lineRule="auto"/>
+      </w:pPr>
+      <w:r>
+        <w:rPr>
+          <w:rFonts w:ascii="Microsoft YaHei" w:hAnsi="Microsoft YaHei" w:eastAsia="Microsoft YaHei"/>
+          <w:b/>
+          <w:color w:val="0F62B0"/>
+          <w:sz w:val="36"/>
+          <w:szCs w:val="36"/>
+        </w:rPr>
+        <w:t>用途与处理范围说明</w:t>
+      </w:r>
+    </w:p>
+    <w:p>
+      <w:pPr>
+        <w:keepLines/>
+        <w:spacing w:before="0" w:after="300" w:line="340" w:lineRule="auto"/>
+      </w:pPr>
+      <w:r>
+        <w:rPr>
+          <w:rFonts w:ascii="Microsoft YaHei" w:hAnsi="Microsoft YaHei" w:eastAsia="Microsoft YaHei"/>
+          <w:color w:val="666666"/>
+          <w:sz w:val="21"/>
+          <w:szCs w:val="21"/>
+        </w:rPr>
+        <w:t>历史工程报告附页 · 2026-10-05</w:t>
+      </w:r>
+    </w:p>
+    <w:p>
+      <w:pPr>
+        <w:keepLines/>
+        <w:spacing w:before="0" w:after="150" w:line="340" w:lineRule="auto"/>
+      </w:pPr>
+      <w:r>
+        <w:rPr>
+          <w:rFonts w:ascii="Microsoft YaHei" w:hAnsi="Microsoft YaHei" w:eastAsia="Microsoft YaHei"/>
+          <w:color w:val="222222"/>
+          <w:sz w:val="22"/>
+          <w:szCs w:val="22"/>
+        </w:rPr>
+        <w:t>项目用途：仅用于男女性用品广告的多国家语言本地化；禁止用于色情类电影的制作、翻译或推广。多国家本地化是产品目标，不表示当前版本已完成所有目标语言的验证。</w:t>
+      </w:r>
+    </w:p>
+    <w:p>
+      <w:pPr>
+        <w:keepLines/>
+        <w:spacing w:before="0" w:after="150" w:line="340" w:lineRule="auto"/>
+      </w:pPr>
+      <w:r>
+        <w:rPr>
+          <w:rFonts w:ascii="Microsoft YaHei" w:hAnsi="Microsoft YaHei" w:eastAsia="Microsoft YaHei"/>
+          <w:color w:val="222222"/>
+          <w:sz w:val="22"/>
+          <w:szCs w:val="22"/>
+        </w:rPr>
+        <w:t>审核与使用责任：本项目不进行内容审核，不判定广告尺度，不提供各国广告法律审查或投放许可。使用方须依据目标国家或地区的相关广告法律自行审核素材、成品及投放行为，并承担其使用责任；项目不对使用方违法内容负责。自动技术验收通过不表示内容合法或允许投放。</w:t>
+      </w:r>
+    </w:p>
+    <w:p>
+      <w:pPr>
+        <w:keepLines/>
+        <w:spacing w:before="0" w:after="150" w:line="340" w:lineRule="auto"/>
+      </w:pPr>
+      <w:r>
+        <w:rPr>
+          <w:rFonts w:ascii="Microsoft YaHei" w:hAnsi="Microsoft YaHei" w:eastAsia="Microsoft YaHei"/>
+          <w:color w:val="222222"/>
+          <w:sz w:val="22"/>
+          <w:szCs w:val="22"/>
+        </w:rPr>
+        <w:t>技术处理范围：限于语言转换，以及脸部定位、跟踪和口型匹配所必需的信息获取与目标人物口型修改。其他画面不分析、不主动修改；不进行身体或场景语义分析、非目标人物修改、无关人脸美化、字幕或产品画面改写。</w:t>
+      </w:r>
+    </w:p>
+    <w:p>
+      <w:pPr>
+        <w:keepLines/>
+        <w:spacing w:before="0" w:after="150" w:line="340" w:lineRule="auto"/>
+      </w:pPr>
+      <w:r>
+        <w:rPr>
+          <w:rFonts w:ascii="Microsoft YaHei" w:hAnsi="Microsoft YaHei" w:eastAsia="Microsoft YaHei"/>
+          <w:color w:val="222222"/>
+          <w:sz w:val="22"/>
+          <w:szCs w:val="22"/>
+        </w:rPr>
+        <w:t>无词发声：喘息、笑声、叹气等无实际词语的声音保留原声，不翻译、不以 TTS 或音色转换替换、不修改口型。与真实台词混合时应按时间区间分别处理；这是语音处理路由，不是内容审核或分级。</w:t>
+      </w:r>
+    </w:p>
+    <w:p>
+      <w:pPr>
+        <w:keepLines/>
+        <w:spacing w:before="0" w:after="150" w:line="340" w:lineRule="auto"/>
+      </w:pPr>
+      <w:r>
+        <w:rPr>
+          <w:rFonts w:ascii="Microsoft YaHei" w:hAnsi="Microsoft YaHei" w:eastAsia="Microsoft YaHei"/>
+          <w:color w:val="222222"/>
+          <w:sz w:val="22"/>
+          <w:szCs w:val="22"/>
+        </w:rPr>
+        <w:t>历史正文说明：本页之后的正文、截图、模型名称、实验事实及版式按原报告保留，仅记录当时情况，不扩大当前用途。历史功能描述不表示现有实现已全部符合上述边界；实现差距仍须独立核验和另行处理。</w:t>
+      </w:r>
+    </w:p>
+    <w:p>
+      <w:pPr>
+        <w:keepLines/>
+        <w:spacing w:before="0" w:after="200" w:line="340" w:lineRule="auto"/>
+      </w:pPr>
+      <w:r>
+        <w:rPr>
+          <w:rFonts w:ascii="Microsoft YaHei" w:hAnsi="Microsoft YaHei" w:eastAsia="Microsoft YaHei"/>
+          <w:color w:val="555555"/>
+          <w:sz w:val="20"/>
+          <w:szCs w:val="20"/>
+        </w:rPr>
+        <w:t>现行范围来源：仓库根目录 README.md 中的“用途与处理范围”（本报告相对路径：../../README.md）。如有后续修订，以该处现行说明为准。</w:t>
+      </w:r>
+    </w:p>
+    <w:p>
+      <w:pPr>
+        <w:spacing w:after="0" w:line="20" w:lineRule="exact"/>
+        <w:sectPr>
+          <w:type w:val="nextPage"/>
+          <w:pgSz w:w="12240" w:h="15840"/>
+          <w:pgMar w:top="1440" w:right="1800" w:bottom="1440" w:left="1800" w:header="720" w:footer="720" w:gutter="0"/>
+          <w:pgNumType w:start="0"/>
+          <w:cols w:space="720"/>
+        </w:sectPr>
+      </w:pPr>
+    </w:p>
     <w:p>
       <w:pPr>
         <w:spacing w:before="1200"/>

</xml_diff>